<commit_message>
Update portfolio from finalized resume
</commit_message>
<xml_diff>
--- a/Resume/Steven Rodriguez Resume.docx
+++ b/Resume/Steven Rodriguez Resume.docx
@@ -261,7 +261,29 @@
         <w:ind w:hanging="360"/>
       </w:pPr>
       <w:r>
-        <w:t>SQL (SQL Server, MySQL, PostgreSQL)</w:t>
+        <w:rPr>
+          <w:b/>
+          <w:bCs/>
+        </w:rPr>
+        <w:t>Data Analysis</w:t>
+      </w:r>
+      <w:r>
+        <w:t>: SQL, Python,</w:t>
+      </w:r>
+      <w:r>
+        <w:t xml:space="preserve"> </w:t>
+      </w:r>
+      <w:r>
+        <w:t>Excel</w:t>
+      </w:r>
+      <w:r>
+        <w:t xml:space="preserve">, </w:t>
+      </w:r>
+      <w:r>
+        <w:t xml:space="preserve">Google </w:t>
+      </w:r>
+      <w:r>
+        <w:t>Sheets</w:t>
       </w:r>
     </w:p>
     <w:p>
@@ -278,19 +300,17 @@
         <w:ind w:hanging="360"/>
       </w:pPr>
       <w:r>
-        <w:t xml:space="preserve">Excel (VLookup, </w:t>
-      </w:r>
-      <w:r>
-        <w:t>Power Query</w:t>
-      </w:r>
-      <w:r>
-        <w:t xml:space="preserve">, </w:t>
-      </w:r>
-      <w:r>
-        <w:t>VBA</w:t>
-      </w:r>
-      <w:r>
-        <w:t>)</w:t>
+        <w:rPr>
+          <w:b/>
+          <w:bCs/>
+        </w:rPr>
+        <w:t>CRM</w:t>
+      </w:r>
+      <w:r>
+        <w:t xml:space="preserve">: </w:t>
+      </w:r>
+      <w:r>
+        <w:t>Salesforce, Monday.com</w:t>
       </w:r>
     </w:p>
     <w:p>
@@ -307,7 +327,17 @@
         <w:ind w:hanging="360"/>
       </w:pPr>
       <w:r>
-        <w:t>Python (Pandas, NumPy, MatPlotLib)</w:t>
+        <w:rPr>
+          <w:b/>
+          <w:bCs/>
+        </w:rPr>
+        <w:t>Automation</w:t>
+      </w:r>
+      <w:r>
+        <w:t xml:space="preserve">: </w:t>
+      </w:r>
+      <w:r>
+        <w:t>n8n, APIs, MCP</w:t>
       </w:r>
     </w:p>
     <w:p>
@@ -324,10 +354,20 @@
         <w:ind w:hanging="360"/>
       </w:pPr>
       <w:r>
-        <w:t>Tableau</w:t>
-      </w:r>
-      <w:r>
-        <w:t xml:space="preserve"> &amp; Microsoft PowerBI</w:t>
+        <w:rPr>
+          <w:b/>
+          <w:bCs/>
+        </w:rPr>
+        <w:t>Business Intelligence</w:t>
+      </w:r>
+      <w:r>
+        <w:t xml:space="preserve">: </w:t>
+      </w:r>
+      <w:r>
+        <w:t>Tableau, Power BI,</w:t>
+      </w:r>
+      <w:r>
+        <w:t xml:space="preserve"> </w:t>
       </w:r>
     </w:p>
     <w:p>
@@ -344,7 +384,14 @@
         <w:ind w:hanging="360"/>
       </w:pPr>
       <w:r>
-        <w:t xml:space="preserve">Fluent Spanish </w:t>
+        <w:rPr>
+          <w:b/>
+          <w:bCs/>
+        </w:rPr>
+        <w:t>Artificial Intelligence</w:t>
+      </w:r>
+      <w:r>
+        <w:t>: Claude Code, Codex</w:t>
       </w:r>
     </w:p>
     <w:p>
@@ -367,16 +414,14 @@
         </w:sectPr>
       </w:pPr>
       <w:r>
-        <w:t xml:space="preserve">Data </w:t>
-      </w:r>
-      <w:r>
-        <w:t>Analysis</w:t>
-      </w:r>
-      <w:r>
-        <w:t xml:space="preserve"> &amp; Visualizatio</w:t>
-      </w:r>
-      <w:r>
-        <w:t>n</w:t>
+        <w:rPr>
+          <w:b/>
+          <w:bCs/>
+        </w:rPr>
+        <w:t>Languages</w:t>
+      </w:r>
+      <w:r>
+        <w:t>: Fluent Spanish</w:t>
       </w:r>
     </w:p>
     <w:p/>
@@ -514,87 +559,43 @@
           <w:sz w:val="20"/>
           <w:szCs w:val="24"/>
         </w:rPr>
-        <w:t>Manage</w:t>
-      </w:r>
-      <w:r>
-        <w:rPr>
-          <w:color w:val="auto"/>
-          <w:sz w:val="20"/>
-          <w:szCs w:val="24"/>
-        </w:rPr>
-        <w:t xml:space="preserve"> and verify </w:t>
-      </w:r>
-      <w:r>
-        <w:rPr>
-          <w:color w:val="auto"/>
-          <w:sz w:val="20"/>
-          <w:szCs w:val="24"/>
-        </w:rPr>
-        <w:t>50</w:t>
-      </w:r>
-      <w:r>
-        <w:rPr>
-          <w:color w:val="auto"/>
-          <w:sz w:val="20"/>
-          <w:szCs w:val="24"/>
-        </w:rPr>
-        <w:t>+</w:t>
-      </w:r>
-      <w:r>
-        <w:rPr>
-          <w:color w:val="auto"/>
-          <w:sz w:val="20"/>
-          <w:szCs w:val="24"/>
-        </w:rPr>
-        <w:t xml:space="preserve"> </w:t>
-      </w:r>
-      <w:r>
-        <w:rPr>
-          <w:color w:val="auto"/>
-          <w:sz w:val="20"/>
-          <w:szCs w:val="24"/>
-        </w:rPr>
-        <w:t>customer</w:t>
-      </w:r>
-      <w:r>
-        <w:rPr>
-          <w:color w:val="auto"/>
-          <w:sz w:val="20"/>
-          <w:szCs w:val="24"/>
-        </w:rPr>
-        <w:t xml:space="preserve"> accounts weekly, ensuring data </w:t>
-      </w:r>
-      <w:r>
-        <w:rPr>
-          <w:color w:val="auto"/>
-          <w:sz w:val="20"/>
-          <w:szCs w:val="24"/>
-        </w:rPr>
-        <w:t>accuracy</w:t>
-      </w:r>
-      <w:r>
-        <w:rPr>
-          <w:color w:val="auto"/>
-          <w:sz w:val="20"/>
-          <w:szCs w:val="24"/>
-        </w:rPr>
-        <w:t xml:space="preserve"> and </w:t>
-      </w:r>
-      <w:r>
-        <w:rPr>
-          <w:color w:val="auto"/>
-          <w:sz w:val="20"/>
-          <w:szCs w:val="24"/>
-        </w:rPr>
-        <w:t xml:space="preserve">FCRA </w:t>
-      </w:r>
-      <w:r>
-        <w:rPr>
-          <w:color w:val="auto"/>
-          <w:sz w:val="20"/>
-          <w:szCs w:val="24"/>
-        </w:rPr>
-        <w:t xml:space="preserve">compliance.  </w:t>
+        <w:t xml:space="preserve">Built and deployed 10+ </w:t>
+      </w:r>
+      <w:r>
+        <w:rPr>
+          <w:b/>
+          <w:bCs/>
+          <w:color w:val="auto"/>
+          <w:sz w:val="20"/>
+          <w:szCs w:val="24"/>
+        </w:rPr>
+        <w:t>n8n</w:t>
+      </w:r>
+      <w:r>
+        <w:rPr>
+          <w:color w:val="auto"/>
+          <w:sz w:val="20"/>
+          <w:szCs w:val="24"/>
+        </w:rPr>
+        <w:t xml:space="preserve"> automations across operations, compliance, and fraud prevention, integrating </w:t>
+      </w:r>
+      <w:r>
+        <w:rPr>
+          <w:b/>
+          <w:bCs/>
+          <w:color w:val="auto"/>
+          <w:sz w:val="20"/>
+          <w:szCs w:val="24"/>
+        </w:rPr>
+        <w:t>APIs</w:t>
+      </w:r>
+      <w:r>
+        <w:rPr>
+          <w:color w:val="auto"/>
+          <w:sz w:val="20"/>
+          <w:szCs w:val="24"/>
+        </w:rPr>
+        <w:t xml:space="preserve"> and business systems to automate 500+ monthly tasks and reduce manual processing time by 60%.</w:t>
       </w:r>
     </w:p>
     <w:p>
@@ -613,31 +614,25 @@
           <w:sz w:val="20"/>
           <w:szCs w:val="24"/>
         </w:rPr>
-        <w:t>Built an AI-driven Salesforce workflow automat</w:t>
-      </w:r>
-      <w:r>
-        <w:rPr>
-          <w:color w:val="auto"/>
-          <w:sz w:val="20"/>
-          <w:szCs w:val="24"/>
-        </w:rPr>
-        <w:t>ing</w:t>
-      </w:r>
-      <w:r>
-        <w:rPr>
-          <w:color w:val="auto"/>
-          <w:sz w:val="20"/>
-          <w:szCs w:val="24"/>
-        </w:rPr>
-        <w:t xml:space="preserve"> 200+ monthly customer account-change requests, reducing processing time by 70% while enforcing fraud and security controls</w:t>
-      </w:r>
-      <w:r>
-        <w:rPr>
-          <w:color w:val="auto"/>
-          <w:sz w:val="20"/>
-          <w:szCs w:val="24"/>
-        </w:rPr>
-        <w:t xml:space="preserve">. </w:t>
+        <w:t xml:space="preserve">Built an AI-driven Salesforce workflow automating 200+ monthly customer account-change requests, reducing processing time by </w:t>
+      </w:r>
+      <w:r>
+        <w:rPr>
+          <w:b/>
+          <w:bCs/>
+          <w:color w:val="auto"/>
+          <w:sz w:val="20"/>
+          <w:szCs w:val="24"/>
+        </w:rPr>
+        <w:t>70%</w:t>
+      </w:r>
+      <w:r>
+        <w:rPr>
+          <w:color w:val="auto"/>
+          <w:sz w:val="20"/>
+          <w:szCs w:val="24"/>
+        </w:rPr>
+        <w:t xml:space="preserve"> while enforcing fraud and security controls.</w:t>
       </w:r>
     </w:p>
     <w:p>
@@ -647,40 +642,26 @@
         <w:rPr>
           <w:color w:val="auto"/>
           <w:sz w:val="20"/>
-          <w:szCs w:val="24"/>
-        </w:rPr>
-      </w:pPr>
-      <w:r>
-        <w:rPr>
-          <w:color w:val="auto"/>
-          <w:sz w:val="20"/>
-          <w:szCs w:val="24"/>
-        </w:rPr>
-        <w:t xml:space="preserve">Investigated and resolved 100+ consumer disputes monthly </w:t>
-      </w:r>
-      <w:r>
-        <w:rPr>
-          <w:color w:val="auto"/>
-          <w:sz w:val="20"/>
-          <w:szCs w:val="24"/>
-        </w:rPr>
-        <w:t xml:space="preserve">with a </w:t>
-      </w:r>
-      <w:r>
-        <w:rPr>
-          <w:color w:val="auto"/>
-          <w:sz w:val="20"/>
-          <w:szCs w:val="24"/>
-        </w:rPr>
-        <w:t>100</w:t>
-      </w:r>
-      <w:r>
-        <w:rPr>
-          <w:color w:val="auto"/>
-          <w:sz w:val="20"/>
-          <w:szCs w:val="24"/>
-        </w:rPr>
-        <w:t>% on-time resolution rate</w:t>
+          <w:szCs w:val="20"/>
+        </w:rPr>
+      </w:pPr>
+      <w:r>
+        <w:rPr>
+          <w:color w:val="auto"/>
+          <w:sz w:val="20"/>
+          <w:szCs w:val="24"/>
+        </w:rPr>
+        <w:t xml:space="preserve">Designed and maintained an end-to-end </w:t>
+      </w:r>
+      <w:r>
+        <w:rPr>
+          <w:b/>
+          <w:bCs/>
+          <w:color w:val="auto"/>
+          <w:sz w:val="20"/>
+          <w:szCs w:val="24"/>
+        </w:rPr>
+        <w:t>ETL</w:t>
       </w:r>
       <w:r>
         <w:rPr>
@@ -696,21 +677,38 @@
           <w:sz w:val="20"/>
           <w:szCs w:val="24"/>
         </w:rPr>
-        <w:t>while maintaining data furnisher standards</w:t>
-      </w:r>
-      <w:r>
-        <w:rPr>
-          <w:color w:val="auto"/>
-          <w:sz w:val="20"/>
-          <w:szCs w:val="24"/>
-        </w:rPr>
-        <w:t xml:space="preserve">. </w:t>
+        <w:t>pipeline</w:t>
+      </w:r>
+      <w:r>
+        <w:rPr>
+          <w:color w:val="auto"/>
+          <w:sz w:val="20"/>
+          <w:szCs w:val="24"/>
+        </w:rPr>
+        <w:t xml:space="preserve"> using Jitterbit, creating 20+ field mappings and transformation logic for </w:t>
+      </w:r>
+      <w:r>
+        <w:rPr>
+          <w:b/>
+          <w:bCs/>
+          <w:color w:val="auto"/>
+          <w:sz w:val="20"/>
+          <w:szCs w:val="24"/>
+        </w:rPr>
+        <w:t>Salesforce</w:t>
+      </w:r>
+      <w:r>
+        <w:rPr>
+          <w:color w:val="auto"/>
+          <w:sz w:val="20"/>
+          <w:szCs w:val="24"/>
+        </w:rPr>
+        <w:t xml:space="preserve"> CRM, processing 1,000+ records weekly and improving customer credit score reporting accuracy.</w:t>
       </w:r>
     </w:p>
     <w:p>
       <w:pPr>
         <w:pStyle w:val="ListParagraph"/>
-        <w:ind w:right="-90"/>
         <w:rPr>
           <w:color w:val="auto"/>
           <w:sz w:val="20"/>
@@ -723,15 +721,7 @@
           <w:sz w:val="20"/>
           <w:szCs w:val="20"/>
         </w:rPr>
-        <w:t>Lorem ipsum dolor sit amet, consectetur adipiscing elit. Suspendisse non ex porta, commodo lorem in, convallis mi</w:t>
-      </w:r>
-      <w:r>
-        <w:rPr>
-          <w:color w:val="auto"/>
-          <w:sz w:val="20"/>
-          <w:szCs w:val="20"/>
-        </w:rPr>
-        <w:t xml:space="preserve">. </w:t>
+        <w:t>Investigated and resolved 100+ consumer disputes monthly with a 100% on-time resolution rate while maintaining data furnisher standards.</w:t>
       </w:r>
     </w:p>
     <w:p>
@@ -750,39 +740,7 @@
           <w:sz w:val="20"/>
           <w:szCs w:val="20"/>
         </w:rPr>
-        <w:t xml:space="preserve">Designed and maintained an end-to-end ETL pipeline using Jitterbit, creating 20+ field mappings and transformation logic for Salesforce CRM, processing </w:t>
-      </w:r>
-      <w:r>
-        <w:rPr>
-          <w:color w:val="auto"/>
-          <w:sz w:val="20"/>
-          <w:szCs w:val="20"/>
-        </w:rPr>
-        <w:t>1,</w:t>
-      </w:r>
-      <w:r>
-        <w:rPr>
-          <w:color w:val="auto"/>
-          <w:sz w:val="20"/>
-          <w:szCs w:val="20"/>
-        </w:rPr>
-        <w:t>00</w:t>
-      </w:r>
-      <w:r>
-        <w:rPr>
-          <w:color w:val="auto"/>
-          <w:sz w:val="20"/>
-          <w:szCs w:val="20"/>
-        </w:rPr>
-        <w:t>0</w:t>
-      </w:r>
-      <w:r>
-        <w:rPr>
-          <w:color w:val="auto"/>
-          <w:sz w:val="20"/>
-          <w:szCs w:val="20"/>
-        </w:rPr>
-        <w:t>+ records weekly and improving customer credit score reporting accuracy.</w:t>
+        <w:t>Audit and verify 50+ customer accounts weekly, ensuring accurate credit reporting and FCRA compliance.</w:t>
       </w:r>
     </w:p>
     <w:p>
@@ -872,210 +830,250 @@
     <w:p>
       <w:pPr>
         <w:pStyle w:val="ListParagraph"/>
-        <w:ind w:right="-90"/>
-        <w:rPr>
-          <w:color w:val="auto"/>
-          <w:sz w:val="20"/>
-          <w:szCs w:val="24"/>
-        </w:rPr>
-      </w:pPr>
-      <w:r>
-        <w:rPr>
-          <w:color w:val="auto"/>
-          <w:sz w:val="20"/>
-          <w:szCs w:val="24"/>
-        </w:rPr>
-        <w:t>Entered, cleaned, and analyzed</w:t>
-      </w:r>
-      <w:r>
-        <w:rPr>
-          <w:color w:val="auto"/>
-          <w:sz w:val="20"/>
-          <w:szCs w:val="24"/>
-        </w:rPr>
-        <w:t xml:space="preserve"> 1,000</w:t>
-      </w:r>
-      <w:r>
-        <w:rPr>
-          <w:color w:val="auto"/>
-          <w:sz w:val="20"/>
-          <w:szCs w:val="24"/>
-        </w:rPr>
-        <w:t>+ CRM records, improving data accuracy by 25% and enhancing reporting.</w:t>
+        <w:rPr>
+          <w:color w:val="auto"/>
+          <w:sz w:val="20"/>
+          <w:szCs w:val="24"/>
+        </w:rPr>
+      </w:pPr>
+      <w:r>
+        <w:rPr>
+          <w:color w:val="auto"/>
+          <w:sz w:val="20"/>
+          <w:szCs w:val="24"/>
+        </w:rPr>
+        <w:t xml:space="preserve">Conducted market research across </w:t>
+      </w:r>
+      <w:r>
+        <w:rPr>
+          <w:b/>
+          <w:bCs/>
+          <w:color w:val="auto"/>
+          <w:sz w:val="20"/>
+          <w:szCs w:val="24"/>
+        </w:rPr>
+        <w:t>5+ databases</w:t>
+      </w:r>
+      <w:r>
+        <w:rPr>
+          <w:color w:val="auto"/>
+          <w:sz w:val="20"/>
+          <w:szCs w:val="24"/>
+        </w:rPr>
+        <w:t xml:space="preserve">, identifying sales opportunities that saved clients </w:t>
+      </w:r>
+      <w:r>
+        <w:rPr>
+          <w:b/>
+          <w:bCs/>
+          <w:color w:val="auto"/>
+          <w:sz w:val="20"/>
+          <w:szCs w:val="24"/>
+        </w:rPr>
+        <w:t>$2,000+ per report</w:t>
+      </w:r>
+      <w:r>
+        <w:rPr>
+          <w:color w:val="auto"/>
+          <w:sz w:val="20"/>
+          <w:szCs w:val="24"/>
+        </w:rPr>
+        <w:t>.</w:t>
       </w:r>
     </w:p>
     <w:p>
       <w:pPr>
         <w:pStyle w:val="ListParagraph"/>
-        <w:ind w:right="-90"/>
-        <w:rPr>
-          <w:color w:val="auto"/>
-          <w:sz w:val="20"/>
-          <w:szCs w:val="24"/>
-        </w:rPr>
-      </w:pPr>
-      <w:r>
-        <w:rPr>
-          <w:color w:val="auto"/>
-          <w:sz w:val="20"/>
-          <w:szCs w:val="24"/>
-        </w:rPr>
-        <w:t xml:space="preserve">Cleaned, standardized, </w:t>
-      </w:r>
-      <w:r>
-        <w:rPr>
-          <w:color w:val="auto"/>
-          <w:sz w:val="20"/>
-          <w:szCs w:val="24"/>
-        </w:rPr>
-        <w:t>and</w:t>
-      </w:r>
-      <w:r>
-        <w:rPr>
-          <w:color w:val="auto"/>
-          <w:sz w:val="20"/>
-          <w:szCs w:val="24"/>
-        </w:rPr>
-        <w:t xml:space="preserve"> validated </w:t>
-      </w:r>
-      <w:r>
-        <w:rPr>
-          <w:color w:val="auto"/>
-          <w:sz w:val="20"/>
-          <w:szCs w:val="24"/>
-        </w:rPr>
-        <w:t>1</w:t>
-      </w:r>
-      <w:r>
-        <w:rPr>
-          <w:color w:val="auto"/>
-          <w:sz w:val="20"/>
-          <w:szCs w:val="24"/>
-        </w:rPr>
-        <w:t xml:space="preserve">00+ rows of </w:t>
-      </w:r>
-      <w:r>
-        <w:rPr>
-          <w:color w:val="auto"/>
-          <w:sz w:val="20"/>
-          <w:szCs w:val="24"/>
-        </w:rPr>
-        <w:t>Excel data</w:t>
-      </w:r>
-      <w:r>
-        <w:rPr>
-          <w:color w:val="auto"/>
-          <w:sz w:val="20"/>
-          <w:szCs w:val="24"/>
-        </w:rPr>
-        <w:t xml:space="preserve">, ensuring data integrity </w:t>
-      </w:r>
-      <w:r>
-        <w:rPr>
-          <w:color w:val="auto"/>
-          <w:sz w:val="20"/>
-          <w:szCs w:val="24"/>
-        </w:rPr>
-        <w:t>and supporting business decision-making</w:t>
-      </w:r>
-      <w:r>
-        <w:rPr>
-          <w:color w:val="auto"/>
-          <w:sz w:val="20"/>
-          <w:szCs w:val="24"/>
-        </w:rPr>
-        <w:t>.</w:t>
+        <w:rPr>
+          <w:color w:val="auto"/>
+          <w:sz w:val="20"/>
+          <w:szCs w:val="24"/>
+        </w:rPr>
+      </w:pPr>
+      <w:r>
+        <w:rPr>
+          <w:color w:val="auto"/>
+          <w:sz w:val="20"/>
+          <w:szCs w:val="24"/>
+        </w:rPr>
+        <w:t xml:space="preserve">Developed </w:t>
+      </w:r>
+      <w:r>
+        <w:rPr>
+          <w:b/>
+          <w:bCs/>
+          <w:color w:val="auto"/>
+          <w:sz w:val="20"/>
+          <w:szCs w:val="24"/>
+        </w:rPr>
+        <w:t>Tableau</w:t>
+      </w:r>
+      <w:r>
+        <w:rPr>
+          <w:color w:val="auto"/>
+          <w:sz w:val="20"/>
+          <w:szCs w:val="24"/>
+        </w:rPr>
+        <w:t xml:space="preserve"> dashboards for leadership, analyzing 1,000+ marketing and survey data points, identifying trends that improved program outreach and engagement by 15%.</w:t>
       </w:r>
     </w:p>
     <w:p>
       <w:pPr>
         <w:pStyle w:val="ListParagraph"/>
-        <w:ind w:right="-90"/>
-        <w:rPr>
-          <w:color w:val="auto"/>
-          <w:sz w:val="20"/>
-          <w:szCs w:val="20"/>
-        </w:rPr>
-      </w:pPr>
-      <w:r>
-        <w:rPr>
-          <w:color w:val="auto"/>
-          <w:sz w:val="20"/>
-          <w:szCs w:val="20"/>
-        </w:rPr>
-        <w:t xml:space="preserve">Conducted market research for business clients by aggregating data from </w:t>
-      </w:r>
-      <w:r>
-        <w:rPr>
-          <w:color w:val="auto"/>
-          <w:sz w:val="20"/>
-          <w:szCs w:val="20"/>
-        </w:rPr>
-        <w:t>5</w:t>
-      </w:r>
-      <w:r>
-        <w:rPr>
-          <w:color w:val="auto"/>
-          <w:sz w:val="20"/>
-          <w:szCs w:val="20"/>
-        </w:rPr>
-        <w:t xml:space="preserve">+ databases, </w:t>
-      </w:r>
-      <w:r>
-        <w:rPr>
-          <w:color w:val="auto"/>
-          <w:sz w:val="20"/>
-          <w:szCs w:val="20"/>
-        </w:rPr>
-        <w:t>delivering actionable insights</w:t>
-      </w:r>
-      <w:r>
-        <w:rPr>
-          <w:color w:val="auto"/>
-          <w:sz w:val="20"/>
-          <w:szCs w:val="20"/>
-        </w:rPr>
-        <w:t xml:space="preserve"> and sales opportunities</w:t>
-      </w:r>
-      <w:r>
-        <w:rPr>
-          <w:color w:val="auto"/>
-          <w:sz w:val="20"/>
-          <w:szCs w:val="20"/>
-        </w:rPr>
-        <w:t xml:space="preserve">, saving clients $2,000+ per report. </w:t>
+        <w:rPr>
+          <w:color w:val="auto"/>
+          <w:sz w:val="20"/>
+          <w:szCs w:val="24"/>
+        </w:rPr>
+      </w:pPr>
+      <w:r>
+        <w:rPr>
+          <w:color w:val="auto"/>
+          <w:sz w:val="20"/>
+          <w:szCs w:val="24"/>
+        </w:rPr>
+        <w:t>Entered, cleaned, and analyzed</w:t>
+      </w:r>
+      <w:r>
+        <w:rPr>
+          <w:color w:val="auto"/>
+          <w:sz w:val="20"/>
+          <w:szCs w:val="24"/>
+        </w:rPr>
+        <w:t xml:space="preserve"> 1,000</w:t>
+      </w:r>
+      <w:r>
+        <w:rPr>
+          <w:color w:val="auto"/>
+          <w:sz w:val="20"/>
+          <w:szCs w:val="24"/>
+        </w:rPr>
+        <w:t xml:space="preserve">+ CRM records, improving data accuracy by </w:t>
+      </w:r>
+      <w:r>
+        <w:rPr>
+          <w:b/>
+          <w:bCs/>
+          <w:color w:val="auto"/>
+          <w:sz w:val="20"/>
+          <w:szCs w:val="24"/>
+        </w:rPr>
+        <w:t>25%</w:t>
+      </w:r>
+      <w:r>
+        <w:rPr>
+          <w:color w:val="auto"/>
+          <w:sz w:val="20"/>
+          <w:szCs w:val="24"/>
+        </w:rPr>
+        <w:t xml:space="preserve"> and enhancing reporting.</w:t>
       </w:r>
     </w:p>
     <w:p>
       <w:pPr>
         <w:pStyle w:val="ListParagraph"/>
-        <w:rPr>
-          <w:color w:val="auto"/>
-          <w:sz w:val="20"/>
-          <w:szCs w:val="20"/>
-        </w:rPr>
-      </w:pPr>
-      <w:r>
-        <w:rPr>
-          <w:color w:val="auto"/>
-          <w:sz w:val="20"/>
-          <w:szCs w:val="20"/>
-        </w:rPr>
-        <w:t xml:space="preserve">Developed Tableau dashboards for leadership, </w:t>
-      </w:r>
-      <w:r>
-        <w:rPr>
-          <w:color w:val="auto"/>
-          <w:sz w:val="20"/>
-          <w:szCs w:val="20"/>
-        </w:rPr>
-        <w:t>analyzing 1,000+ marketing and survey data points, identifying trends that improved program outreach and engagement by 15%</w:t>
-      </w:r>
-      <w:r>
-        <w:rPr>
-          <w:color w:val="auto"/>
-          <w:sz w:val="20"/>
-          <w:szCs w:val="20"/>
+        <w:ind w:right="-90"/>
+        <w:rPr>
+          <w:color w:val="auto"/>
+          <w:sz w:val="20"/>
+          <w:szCs w:val="24"/>
+        </w:rPr>
+      </w:pPr>
+      <w:r>
+        <w:rPr>
+          <w:color w:val="auto"/>
+          <w:sz w:val="20"/>
+          <w:szCs w:val="24"/>
+        </w:rPr>
+        <w:t>Transformed</w:t>
+      </w:r>
+      <w:r>
+        <w:rPr>
+          <w:color w:val="auto"/>
+          <w:sz w:val="20"/>
+          <w:szCs w:val="24"/>
+        </w:rPr>
+        <w:t xml:space="preserve">, standardized, </w:t>
+      </w:r>
+      <w:r>
+        <w:rPr>
+          <w:color w:val="auto"/>
+          <w:sz w:val="20"/>
+          <w:szCs w:val="24"/>
+        </w:rPr>
+        <w:t>and</w:t>
+      </w:r>
+      <w:r>
+        <w:rPr>
+          <w:color w:val="auto"/>
+          <w:sz w:val="20"/>
+          <w:szCs w:val="24"/>
+        </w:rPr>
+        <w:t xml:space="preserve"> validated </w:t>
+      </w:r>
+      <w:r>
+        <w:rPr>
+          <w:color w:val="auto"/>
+          <w:sz w:val="20"/>
+          <w:szCs w:val="24"/>
+        </w:rPr>
+        <w:t>1</w:t>
+      </w:r>
+      <w:r>
+        <w:rPr>
+          <w:color w:val="auto"/>
+          <w:sz w:val="20"/>
+          <w:szCs w:val="24"/>
+        </w:rPr>
+        <w:t>,0</w:t>
+      </w:r>
+      <w:r>
+        <w:rPr>
+          <w:color w:val="auto"/>
+          <w:sz w:val="20"/>
+          <w:szCs w:val="24"/>
+        </w:rPr>
+        <w:t xml:space="preserve">00+ rows of </w:t>
+      </w:r>
+      <w:r>
+        <w:rPr>
+          <w:b/>
+          <w:bCs/>
+          <w:color w:val="auto"/>
+          <w:sz w:val="20"/>
+          <w:szCs w:val="24"/>
+        </w:rPr>
+        <w:t>Excel</w:t>
+      </w:r>
+      <w:r>
+        <w:rPr>
+          <w:color w:val="auto"/>
+          <w:sz w:val="20"/>
+          <w:szCs w:val="24"/>
+        </w:rPr>
+        <w:t xml:space="preserve"> data</w:t>
+      </w:r>
+      <w:r>
+        <w:rPr>
+          <w:color w:val="auto"/>
+          <w:sz w:val="20"/>
+          <w:szCs w:val="24"/>
+        </w:rPr>
+        <w:t xml:space="preserve">, ensuring data integrity </w:t>
+      </w:r>
+      <w:r>
+        <w:rPr>
+          <w:color w:val="auto"/>
+          <w:sz w:val="20"/>
+          <w:szCs w:val="24"/>
+        </w:rPr>
+        <w:t>and supporting business decision-making</w:t>
+      </w:r>
+      <w:r>
+        <w:rPr>
+          <w:color w:val="auto"/>
+          <w:sz w:val="20"/>
+          <w:szCs w:val="24"/>
         </w:rPr>
         <w:t>.</w:t>
       </w:r>
@@ -1231,11 +1229,21 @@
       </w:r>
       <w:r>
         <w:rPr>
-          <w:color w:val="auto"/>
-          <w:sz w:val="20"/>
-          <w:szCs w:val="24"/>
-        </w:rPr>
-        <w:t xml:space="preserve">6% through </w:t>
+          <w:b/>
+          <w:bCs/>
+          <w:color w:val="auto"/>
+          <w:sz w:val="20"/>
+          <w:szCs w:val="24"/>
+        </w:rPr>
+        <w:t>6%</w:t>
+      </w:r>
+      <w:r>
+        <w:rPr>
+          <w:color w:val="auto"/>
+          <w:sz w:val="20"/>
+          <w:szCs w:val="24"/>
+        </w:rPr>
+        <w:t xml:space="preserve"> through </w:t>
       </w:r>
       <w:r>
         <w:rPr>
@@ -1275,7 +1283,17 @@
           <w:sz w:val="20"/>
           <w:szCs w:val="24"/>
         </w:rPr>
-        <w:t>data using Excel Pivot</w:t>
+        <w:t xml:space="preserve">data using </w:t>
+      </w:r>
+      <w:r>
+        <w:rPr>
+          <w:b/>
+          <w:bCs/>
+          <w:color w:val="auto"/>
+          <w:sz w:val="20"/>
+          <w:szCs w:val="24"/>
+        </w:rPr>
+        <w:t>Excel Pivot</w:t>
       </w:r>
       <w:r>
         <w:rPr>
@@ -1310,7 +1328,25 @@
           <w:sz w:val="20"/>
           <w:szCs w:val="24"/>
         </w:rPr>
-        <w:t xml:space="preserve"> Target Greenfield to pull team performance data, created KPI reports/dashboards, </w:t>
+        <w:t xml:space="preserve"> Target Greenfield to pull team performance data, created KPI </w:t>
+      </w:r>
+      <w:r>
+        <w:rPr>
+          <w:b/>
+          <w:bCs/>
+          <w:color w:val="auto"/>
+          <w:sz w:val="20"/>
+          <w:szCs w:val="24"/>
+        </w:rPr>
+        <w:t>reports/dashboards</w:t>
+      </w:r>
+      <w:r>
+        <w:rPr>
+          <w:color w:val="auto"/>
+          <w:sz w:val="20"/>
+          <w:szCs w:val="24"/>
+        </w:rPr>
+        <w:t xml:space="preserve">, </w:t>
       </w:r>
       <w:r>
         <w:rPr>
@@ -1326,7 +1362,43 @@
           <w:sz w:val="20"/>
           <w:szCs w:val="24"/>
         </w:rPr>
-        <w:t>created action plans that led to a 30% improvement in KPI metrics.</w:t>
+        <w:t xml:space="preserve">created action plans that led to a </w:t>
+      </w:r>
+      <w:r>
+        <w:rPr>
+          <w:b/>
+          <w:bCs/>
+          <w:color w:val="auto"/>
+          <w:sz w:val="20"/>
+          <w:szCs w:val="24"/>
+        </w:rPr>
+        <w:t>30%</w:t>
+      </w:r>
+      <w:r>
+        <w:rPr>
+          <w:color w:val="auto"/>
+          <w:sz w:val="20"/>
+          <w:szCs w:val="24"/>
+        </w:rPr>
+        <w:t xml:space="preserve"> improvement in </w:t>
+      </w:r>
+      <w:r>
+        <w:rPr>
+          <w:b/>
+          <w:bCs/>
+          <w:color w:val="auto"/>
+          <w:sz w:val="20"/>
+          <w:szCs w:val="24"/>
+        </w:rPr>
+        <w:t>KPI</w:t>
+      </w:r>
+      <w:r>
+        <w:rPr>
+          <w:color w:val="auto"/>
+          <w:sz w:val="20"/>
+          <w:szCs w:val="24"/>
+        </w:rPr>
+        <w:t xml:space="preserve"> metrics.</w:t>
       </w:r>
     </w:p>
     <w:p>
@@ -1345,7 +1417,25 @@
           <w:sz w:val="20"/>
           <w:szCs w:val="20"/>
         </w:rPr>
-        <w:t>Prevented $100k in potential inventory loss by analyzing 1,000 rows of inventory and sales data in Excel</w:t>
+        <w:t xml:space="preserve">Prevented </w:t>
+      </w:r>
+      <w:r>
+        <w:rPr>
+          <w:b/>
+          <w:bCs/>
+          <w:color w:val="auto"/>
+          <w:sz w:val="20"/>
+          <w:szCs w:val="20"/>
+        </w:rPr>
+        <w:t xml:space="preserve">$100k </w:t>
+      </w:r>
+      <w:r>
+        <w:rPr>
+          <w:color w:val="auto"/>
+          <w:sz w:val="20"/>
+          <w:szCs w:val="20"/>
+        </w:rPr>
+        <w:t>in potential inventory loss by analyzing 1,000 rows of inventory and sales data in Excel</w:t>
       </w:r>
       <w:r>
         <w:rPr>
@@ -1547,240 +1637,210 @@
     </w:p>
     <w:p>
       <w:pPr>
-        <w:rPr>
-          <w:b/>
-          <w:bCs/>
-          <w:caps/>
-          <w:color w:val="auto"/>
-          <w:spacing w:val="20"/>
-        </w:rPr>
-      </w:pPr>
-      <w:r>
-        <w:rPr>
-          <w:b/>
-          <w:bCs/>
-          <w:caps/>
-          <w:color w:val="auto"/>
-          <w:spacing w:val="20"/>
-        </w:rPr>
-        <w:t>Associate</w:t>
-      </w:r>
-      <w:r>
-        <w:rPr>
-          <w:b/>
-          <w:bCs/>
-          <w:caps/>
-          <w:color w:val="auto"/>
-          <w:spacing w:val="20"/>
-        </w:rPr>
-        <w:t xml:space="preserve"> </w:t>
-      </w:r>
-      <w:r>
-        <w:rPr>
-          <w:b/>
-          <w:bCs/>
-          <w:caps/>
-          <w:color w:val="auto"/>
-          <w:spacing w:val="20"/>
-        </w:rPr>
-        <w:t xml:space="preserve">in Business </w:t>
-      </w:r>
-      <w:r>
-        <w:rPr>
-          <w:b/>
-          <w:bCs/>
-          <w:caps/>
-          <w:color w:val="auto"/>
-          <w:spacing w:val="20"/>
-        </w:rPr>
-        <w:t>ADMIN</w:t>
-      </w:r>
-      <w:r>
-        <w:rPr>
-          <w:b/>
-          <w:bCs/>
-          <w:caps/>
-          <w:color w:val="auto"/>
-          <w:spacing w:val="20"/>
-        </w:rPr>
-        <w:t xml:space="preserve"> &amp; Management </w:t>
-      </w:r>
-      <w:r>
-        <w:rPr>
-          <w:color w:val="auto"/>
-        </w:rPr>
-        <w:t>–</w:t>
-      </w:r>
-      <w:r>
-        <w:rPr>
-          <w:color w:val="auto"/>
-        </w:rPr>
-        <w:t xml:space="preserve"> </w:t>
-      </w:r>
-      <w:r>
-        <w:rPr>
-          <w:color w:val="auto"/>
-        </w:rPr>
-        <w:t xml:space="preserve">Fullerton College </w:t>
-      </w:r>
-      <w:r>
-        <w:rPr>
-          <w:color w:val="auto"/>
-        </w:rPr>
-        <w:t>–</w:t>
-      </w:r>
-      <w:r>
-        <w:rPr>
-          <w:color w:val="auto"/>
-        </w:rPr>
-        <w:t xml:space="preserve"> </w:t>
-      </w:r>
-      <w:r>
-        <w:rPr>
-          <w:color w:val="auto"/>
-        </w:rPr>
-        <w:t>Fullerton, CA</w:t>
-      </w:r>
-      <w:r>
-        <w:rPr>
-          <w:color w:val="auto"/>
-        </w:rPr>
-        <w:t xml:space="preserve">, with High Honors </w:t>
-      </w:r>
-      <w:r>
-        <w:rPr>
-          <w:color w:val="auto"/>
-        </w:rPr>
-        <w:tab/>
-      </w:r>
-      <w:r>
-        <w:rPr>
-          <w:color w:val="auto"/>
-        </w:rPr>
-        <w:t>May</w:t>
-      </w:r>
-      <w:r>
-        <w:rPr>
-          <w:color w:val="auto"/>
-        </w:rPr>
-        <w:t xml:space="preserve"> </w:t>
-      </w:r>
-      <w:r>
-        <w:rPr>
-          <w:color w:val="auto"/>
-        </w:rPr>
-        <w:t>2023</w:t>
+        <w:pStyle w:val="Heading1"/>
+        <w:ind w:right="-90"/>
+        <w:rPr>
+          <w:rStyle w:val="CapsExpandedColored"/>
+          <w:b/>
+          <w:caps w:val="0"/>
+          <w:color w:val="auto"/>
+          <w:spacing w:val="0"/>
+        </w:rPr>
+      </w:pPr>
+      <w:r>
+        <w:rPr>
+          <w:rFonts w:asciiTheme="minorHAnsi" w:hAnsiTheme="minorHAnsi" w:cstheme="minorHAnsi"/>
+          <w:color w:val="auto"/>
+        </w:rPr>
+        <w:t>Projects</w:t>
       </w:r>
     </w:p>
     <w:p>
       <w:pPr>
-        <w:rPr>
-          <w:color w:val="auto"/>
-          <w:szCs w:val="24"/>
-        </w:rPr>
-      </w:pPr>
-      <w:r>
-        <w:rPr>
-          <w:color w:val="auto"/>
-          <w:szCs w:val="24"/>
-        </w:rPr>
-        <w:t xml:space="preserve">Major: </w:t>
-      </w:r>
-      <w:r>
-        <w:rPr>
-          <w:b/>
-          <w:bCs/>
-          <w:color w:val="auto"/>
-          <w:szCs w:val="24"/>
-        </w:rPr>
-        <w:t>Business Administration &amp; Management</w:t>
-      </w:r>
-      <w:r>
-        <w:rPr>
-          <w:color w:val="auto"/>
-          <w:szCs w:val="24"/>
-        </w:rPr>
-        <w:t xml:space="preserve"> </w:t>
-      </w:r>
-      <w:r>
-        <w:rPr>
-          <w:b/>
-          <w:bCs/>
-          <w:color w:val="auto"/>
-          <w:szCs w:val="24"/>
-        </w:rPr>
-        <w:t>GPA: 3.</w:t>
-      </w:r>
-      <w:r>
-        <w:rPr>
-          <w:b/>
-          <w:bCs/>
-          <w:color w:val="auto"/>
-          <w:szCs w:val="24"/>
-        </w:rPr>
-        <w:t>73</w:t>
+        <w:ind w:right="-90"/>
+        <w:rPr>
+          <w:b/>
+          <w:caps/>
+          <w:color w:val="auto"/>
+          <w:spacing w:val="20"/>
+        </w:rPr>
+      </w:pPr>
+      <w:r>
+        <w:rPr>
+          <w:rStyle w:val="CapsExpandedColored"/>
+          <w:color w:val="auto"/>
+        </w:rPr>
+        <w:t>2025 Client &amp; Market Analysis Report (Excel)</w:t>
+      </w:r>
+      <w:r>
+        <w:rPr>
+          <w:color w:val="auto"/>
+        </w:rPr>
+        <w:tab/>
+      </w:r>
+      <w:r>
+        <w:rPr>
+          <w:color w:val="auto"/>
+        </w:rPr>
+        <w:t>April</w:t>
+      </w:r>
+      <w:r>
+        <w:rPr>
+          <w:color w:val="auto"/>
+        </w:rPr>
+        <w:t xml:space="preserve"> 202</w:t>
+      </w:r>
+      <w:r>
+        <w:rPr>
+          <w:color w:val="auto"/>
+        </w:rPr>
+        <w:t>6</w:t>
       </w:r>
     </w:p>
     <w:p>
       <w:pPr>
-        <w:pStyle w:val="Heading1"/>
+        <w:pStyle w:val="ListParagraph"/>
         <w:ind w:right="-90"/>
         <w:rPr>
-          <w:rStyle w:val="CapsExpandedColored"/>
-          <w:b/>
-          <w:caps w:val="0"/>
-          <w:color w:val="auto"/>
-          <w:spacing w:val="0"/>
-        </w:rPr>
-      </w:pPr>
-      <w:r>
-        <w:rPr>
-          <w:rFonts w:asciiTheme="minorHAnsi" w:hAnsiTheme="minorHAnsi" w:cstheme="minorHAnsi"/>
-          <w:color w:val="auto"/>
-        </w:rPr>
-        <w:t>Projects</w:t>
+          <w:color w:val="auto"/>
+          <w:sz w:val="20"/>
+          <w:szCs w:val="32"/>
+        </w:rPr>
+      </w:pPr>
+      <w:r>
+        <w:rPr>
+          <w:color w:val="auto"/>
+          <w:sz w:val="20"/>
+          <w:szCs w:val="28"/>
+        </w:rPr>
+        <w:t xml:space="preserve">Analyzed </w:t>
+      </w:r>
+      <w:r>
+        <w:rPr>
+          <w:b/>
+          <w:bCs/>
+          <w:color w:val="auto"/>
+          <w:sz w:val="20"/>
+          <w:szCs w:val="28"/>
+        </w:rPr>
+        <w:t>7,</w:t>
+      </w:r>
+      <w:r>
+        <w:rPr>
+          <w:b/>
+          <w:bCs/>
+          <w:color w:val="auto"/>
+          <w:sz w:val="20"/>
+          <w:szCs w:val="28"/>
+        </w:rPr>
+        <w:t>000</w:t>
+      </w:r>
+      <w:r>
+        <w:rPr>
+          <w:b/>
+          <w:bCs/>
+          <w:color w:val="auto"/>
+          <w:sz w:val="20"/>
+          <w:szCs w:val="28"/>
+        </w:rPr>
+        <w:t xml:space="preserve">+ CRM client records </w:t>
+      </w:r>
+      <w:r>
+        <w:rPr>
+          <w:color w:val="auto"/>
+          <w:sz w:val="20"/>
+          <w:szCs w:val="28"/>
+        </w:rPr>
+        <w:t xml:space="preserve">across Orange, Riverside, and San Bernardino counties to evaluate geographic client distribution and market </w:t>
+      </w:r>
+      <w:r>
+        <w:rPr>
+          <w:color w:val="auto"/>
+          <w:sz w:val="20"/>
+          <w:szCs w:val="28"/>
+        </w:rPr>
+        <w:t>share by city</w:t>
+      </w:r>
+      <w:r>
+        <w:rPr>
+          <w:color w:val="auto"/>
+          <w:sz w:val="20"/>
+          <w:szCs w:val="28"/>
+        </w:rPr>
+        <w:t xml:space="preserve">. </w:t>
       </w:r>
     </w:p>
     <w:p>
       <w:pPr>
+        <w:pStyle w:val="ListParagraph"/>
         <w:ind w:right="-90"/>
         <w:rPr>
-          <w:b/>
-          <w:caps/>
-          <w:color w:val="auto"/>
-          <w:spacing w:val="20"/>
-        </w:rPr>
-      </w:pPr>
-      <w:r>
-        <w:rPr>
-          <w:rStyle w:val="CapsExpandedColored"/>
-          <w:color w:val="auto"/>
-        </w:rPr>
-        <w:t>2025 Client &amp; Market Analysis Report (Excel)</w:t>
-      </w:r>
-      <w:r>
-        <w:rPr>
-          <w:color w:val="auto"/>
-        </w:rPr>
-        <w:tab/>
-      </w:r>
-      <w:r>
-        <w:rPr>
-          <w:color w:val="auto"/>
-        </w:rPr>
-        <w:t>April</w:t>
-      </w:r>
-      <w:r>
-        <w:rPr>
-          <w:color w:val="auto"/>
-        </w:rPr>
-        <w:t xml:space="preserve"> 202</w:t>
-      </w:r>
-      <w:r>
-        <w:rPr>
-          <w:color w:val="auto"/>
-        </w:rPr>
-        <w:t>6</w:t>
+          <w:color w:val="auto"/>
+          <w:sz w:val="20"/>
+          <w:szCs w:val="36"/>
+        </w:rPr>
+      </w:pPr>
+      <w:r>
+        <w:rPr>
+          <w:color w:val="auto"/>
+          <w:sz w:val="20"/>
+          <w:szCs w:val="36"/>
+        </w:rPr>
+        <w:t xml:space="preserve">Built Excel county reports using </w:t>
+      </w:r>
+      <w:r>
+        <w:rPr>
+          <w:b/>
+          <w:bCs/>
+          <w:color w:val="auto"/>
+          <w:sz w:val="20"/>
+          <w:szCs w:val="36"/>
+        </w:rPr>
+        <w:t>PivotTables</w:t>
+      </w:r>
+      <w:r>
+        <w:rPr>
+          <w:color w:val="auto"/>
+          <w:sz w:val="20"/>
+          <w:szCs w:val="36"/>
+        </w:rPr>
+        <w:t xml:space="preserve">, </w:t>
+      </w:r>
+      <w:r>
+        <w:rPr>
+          <w:b/>
+          <w:bCs/>
+          <w:color w:val="auto"/>
+          <w:sz w:val="20"/>
+          <w:szCs w:val="36"/>
+        </w:rPr>
+        <w:t>XLOOKUP</w:t>
+      </w:r>
+      <w:r>
+        <w:rPr>
+          <w:color w:val="auto"/>
+          <w:sz w:val="20"/>
+          <w:szCs w:val="36"/>
+        </w:rPr>
+        <w:t xml:space="preserve">, and </w:t>
+      </w:r>
+      <w:r>
+        <w:rPr>
+          <w:b/>
+          <w:bCs/>
+          <w:color w:val="auto"/>
+          <w:sz w:val="20"/>
+          <w:szCs w:val="36"/>
+        </w:rPr>
+        <w:t>Power Query</w:t>
+      </w:r>
+      <w:r>
+        <w:rPr>
+          <w:color w:val="auto"/>
+          <w:sz w:val="20"/>
+          <w:szCs w:val="36"/>
+        </w:rPr>
+        <w:t xml:space="preserve"> to consolidate population, county, and client data.</w:t>
       </w:r>
     </w:p>
     <w:p>
@@ -1797,9 +1857,17 @@
         <w:rPr>
           <w:color w:val="auto"/>
           <w:sz w:val="20"/>
-          <w:szCs w:val="28"/>
-        </w:rPr>
-        <w:t xml:space="preserve">Analyzed </w:t>
+          <w:szCs w:val="32"/>
+        </w:rPr>
+        <w:t>Utilized</w:t>
+      </w:r>
+      <w:r>
+        <w:rPr>
+          <w:color w:val="auto"/>
+          <w:sz w:val="20"/>
+          <w:szCs w:val="32"/>
+        </w:rPr>
+        <w:t xml:space="preserve"> </w:t>
       </w:r>
       <w:r>
         <w:rPr>
@@ -1807,9 +1875,25 @@
           <w:bCs/>
           <w:color w:val="auto"/>
           <w:sz w:val="20"/>
-          <w:szCs w:val="28"/>
-        </w:rPr>
-        <w:t>7,</w:t>
+          <w:szCs w:val="32"/>
+        </w:rPr>
+        <w:t>AI-assisted data cleaning</w:t>
+      </w:r>
+      <w:r>
+        <w:rPr>
+          <w:color w:val="auto"/>
+          <w:sz w:val="20"/>
+          <w:szCs w:val="32"/>
+        </w:rPr>
+        <w:t xml:space="preserve"> to standardize inconsistent city names, misspellings, and duplicate entries, reducing manual cleanup time by an </w:t>
+      </w:r>
+      <w:r>
+        <w:rPr>
+          <w:color w:val="auto"/>
+          <w:sz w:val="20"/>
+          <w:szCs w:val="32"/>
+        </w:rPr>
+        <w:t>estimated</w:t>
       </w:r>
       <w:r>
         <w:rPr>
@@ -1817,9 +1901,9 @@
           <w:bCs/>
           <w:color w:val="auto"/>
           <w:sz w:val="20"/>
-          <w:szCs w:val="28"/>
-        </w:rPr>
-        <w:t>000</w:t>
+          <w:szCs w:val="32"/>
+        </w:rPr>
+        <w:t xml:space="preserve"> 80%+</w:t>
       </w:r>
       <w:r>
         <w:rPr>
@@ -1827,33 +1911,9 @@
           <w:bCs/>
           <w:color w:val="auto"/>
           <w:sz w:val="20"/>
-          <w:szCs w:val="28"/>
-        </w:rPr>
-        <w:t xml:space="preserve">+ CRM client records </w:t>
-      </w:r>
-      <w:r>
-        <w:rPr>
-          <w:color w:val="auto"/>
-          <w:sz w:val="20"/>
-          <w:szCs w:val="28"/>
-        </w:rPr>
-        <w:t xml:space="preserve">across Orange, Riverside, and San Bernardino counties to evaluate geographic client distribution and market </w:t>
-      </w:r>
-      <w:r>
-        <w:rPr>
-          <w:color w:val="auto"/>
-          <w:sz w:val="20"/>
-          <w:szCs w:val="28"/>
-        </w:rPr>
-        <w:t>share by city</w:t>
-      </w:r>
-      <w:r>
-        <w:rPr>
-          <w:color w:val="auto"/>
-          <w:sz w:val="20"/>
-          <w:szCs w:val="28"/>
-        </w:rPr>
-        <w:t xml:space="preserve">. </w:t>
+          <w:szCs w:val="32"/>
+        </w:rPr>
+        <w:t>.</w:t>
       </w:r>
     </w:p>
     <w:p>
@@ -1863,16 +1923,24 @@
         <w:rPr>
           <w:color w:val="auto"/>
           <w:sz w:val="20"/>
-          <w:szCs w:val="36"/>
-        </w:rPr>
-      </w:pPr>
-      <w:r>
-        <w:rPr>
-          <w:color w:val="auto"/>
-          <w:sz w:val="20"/>
-          <w:szCs w:val="36"/>
-        </w:rPr>
-        <w:t xml:space="preserve">Built Excel county reports using </w:t>
+          <w:szCs w:val="32"/>
+        </w:rPr>
+      </w:pPr>
+      <w:r>
+        <w:rPr>
+          <w:color w:val="auto"/>
+          <w:sz w:val="20"/>
+          <w:szCs w:val="32"/>
+        </w:rPr>
+        <w:t xml:space="preserve">Leveraged </w:t>
+      </w:r>
+      <w:r>
+        <w:rPr>
+          <w:color w:val="auto"/>
+          <w:sz w:val="20"/>
+          <w:szCs w:val="32"/>
+        </w:rPr>
+        <w:t>U.S. Census population data via</w:t>
       </w:r>
       <w:r>
         <w:rPr>
@@ -1880,72 +1948,17 @@
           <w:bCs/>
           <w:color w:val="auto"/>
           <w:sz w:val="20"/>
-          <w:szCs w:val="36"/>
-        </w:rPr>
-        <w:t>PivotTables</w:t>
-      </w:r>
-      <w:r>
-        <w:rPr>
-          <w:color w:val="auto"/>
-          <w:sz w:val="20"/>
-          <w:szCs w:val="36"/>
-        </w:rPr>
-        <w:t xml:space="preserve">, </w:t>
-      </w:r>
-      <w:r>
-        <w:rPr>
-          <w:b/>
-          <w:bCs/>
-          <w:color w:val="auto"/>
-          <w:sz w:val="20"/>
-          <w:szCs w:val="36"/>
-        </w:rPr>
-        <w:t>XLOOKUP</w:t>
-      </w:r>
-      <w:r>
-        <w:rPr>
-          <w:color w:val="auto"/>
-          <w:sz w:val="20"/>
-          <w:szCs w:val="36"/>
-        </w:rPr>
-        <w:t xml:space="preserve">, and </w:t>
-      </w:r>
-      <w:r>
-        <w:rPr>
-          <w:b/>
-          <w:bCs/>
-          <w:color w:val="auto"/>
-          <w:sz w:val="20"/>
-          <w:szCs w:val="36"/>
-        </w:rPr>
-        <w:t>Power Query</w:t>
-      </w:r>
-      <w:r>
-        <w:rPr>
-          <w:color w:val="auto"/>
-          <w:sz w:val="20"/>
-          <w:szCs w:val="36"/>
-        </w:rPr>
-        <w:t xml:space="preserve"> to consolidate population, county, and client data.</w:t>
-      </w:r>
-    </w:p>
-    <w:p>
-      <w:pPr>
-        <w:pStyle w:val="ListParagraph"/>
-        <w:ind w:right="-90"/>
-        <w:rPr>
-          <w:color w:val="auto"/>
-          <w:sz w:val="20"/>
           <w:szCs w:val="32"/>
         </w:rPr>
-      </w:pPr>
+        <w:t xml:space="preserve"> API/external datasets</w:t>
+      </w:r>
       <w:r>
         <w:rPr>
           <w:color w:val="auto"/>
           <w:sz w:val="20"/>
           <w:szCs w:val="32"/>
         </w:rPr>
-        <w:t>Utilized</w:t>
+        <w:t xml:space="preserve">, improving data accuracy by </w:t>
       </w:r>
       <w:r>
         <w:rPr>
@@ -1953,113 +1966,18 @@
           <w:sz w:val="20"/>
           <w:szCs w:val="32"/>
         </w:rPr>
-        <w:t xml:space="preserve"> </w:t>
-      </w:r>
-      <w:r>
-        <w:rPr>
-          <w:b/>
-          <w:bCs/>
+        <w:t>30%+</w:t>
+      </w:r>
+      <w:r>
+        <w:rPr>
           <w:color w:val="auto"/>
           <w:sz w:val="20"/>
           <w:szCs w:val="32"/>
         </w:rPr>
-        <w:t>AI-assisted data cleaning</w:t>
-      </w:r>
-      <w:r>
-        <w:rPr>
-          <w:color w:val="auto"/>
-          <w:sz w:val="20"/>
-          <w:szCs w:val="32"/>
-        </w:rPr>
-        <w:t xml:space="preserve"> to standardize inconsistent city names, misspellings, and duplicate entries, reducing manual cleanup time by an </w:t>
-      </w:r>
-      <w:r>
-        <w:rPr>
-          <w:color w:val="auto"/>
-          <w:sz w:val="20"/>
-          <w:szCs w:val="32"/>
-        </w:rPr>
-        <w:t>estimated</w:t>
-      </w:r>
-      <w:r>
-        <w:rPr>
-          <w:b/>
-          <w:bCs/>
-          <w:color w:val="auto"/>
-          <w:sz w:val="20"/>
-          <w:szCs w:val="32"/>
-        </w:rPr>
-        <w:t xml:space="preserve"> 80%+</w:t>
-      </w:r>
-      <w:r>
-        <w:rPr>
-          <w:b/>
-          <w:bCs/>
-          <w:color w:val="auto"/>
-          <w:sz w:val="20"/>
-          <w:szCs w:val="32"/>
-        </w:rPr>
-        <w:t>.</w:t>
-      </w:r>
-    </w:p>
-    <w:p>
-      <w:pPr>
-        <w:pStyle w:val="ListParagraph"/>
-        <w:ind w:right="-90"/>
-        <w:rPr>
-          <w:color w:val="auto"/>
-          <w:sz w:val="20"/>
-          <w:szCs w:val="32"/>
-        </w:rPr>
-      </w:pPr>
-      <w:r>
-        <w:rPr>
-          <w:color w:val="auto"/>
-          <w:sz w:val="20"/>
-          <w:szCs w:val="32"/>
-        </w:rPr>
-        <w:t xml:space="preserve">Leveraged </w:t>
-      </w:r>
-      <w:r>
-        <w:rPr>
-          <w:b/>
-          <w:bCs/>
-          <w:color w:val="auto"/>
-          <w:sz w:val="20"/>
-          <w:szCs w:val="32"/>
-        </w:rPr>
-        <w:t>U.S. Census population data via API/external datasets</w:t>
-      </w:r>
-      <w:r>
-        <w:rPr>
-          <w:color w:val="auto"/>
-          <w:sz w:val="20"/>
-          <w:szCs w:val="32"/>
-        </w:rPr>
-        <w:t xml:space="preserve">, improving data accuracy by </w:t>
-      </w:r>
-      <w:r>
-        <w:rPr>
-          <w:b/>
-          <w:bCs/>
-          <w:color w:val="auto"/>
-          <w:sz w:val="20"/>
-          <w:szCs w:val="32"/>
-        </w:rPr>
-        <w:t>30%+</w:t>
-      </w:r>
-      <w:r>
-        <w:rPr>
-          <w:color w:val="auto"/>
-          <w:sz w:val="20"/>
-          <w:szCs w:val="32"/>
-        </w:rPr>
         <w:t xml:space="preserve"> and identifying </w:t>
       </w:r>
       <w:r>
         <w:rPr>
-          <w:b/>
-          <w:bCs/>
           <w:color w:val="auto"/>
           <w:sz w:val="20"/>
           <w:szCs w:val="32"/>

</xml_diff>